<commit_message>
Added Individual Reflection Section
</commit_message>
<xml_diff>
--- a/SWEP_CA_DOCUMENT.docx
+++ b/SWEP_CA_DOCUMENT.docx
@@ -4045,7 +4045,7 @@
             </w:rPr>
             <w:fldChar w:fldCharType="separate"/>
           </w:r>
-          <w:hyperlink w:anchor="_Toc227176348" w:history="1">
+          <w:hyperlink w:anchor="_Toc228457212" w:history="1">
             <w:r>
               <w:rPr>
                 <w:rStyle w:val="Hyperlink"/>
@@ -4076,7 +4076,7 @@
                 <w:noProof/>
                 <w:webHidden/>
               </w:rPr>
-              <w:instrText xml:space="preserve"> PAGEREF _Toc227176348 \h </w:instrText>
+              <w:instrText xml:space="preserve"> PAGEREF _Toc228457212 \h </w:instrText>
             </w:r>
             <w:r>
               <w:rPr>
@@ -4123,7 +4123,7 @@
               <w:lang w:eastAsia="en-GB"/>
             </w:rPr>
           </w:pPr>
-          <w:hyperlink w:anchor="_Toc227176349" w:history="1">
+          <w:hyperlink w:anchor="_Toc228457213" w:history="1">
             <w:r>
               <w:rPr>
                 <w:rStyle w:val="Hyperlink"/>
@@ -4154,7 +4154,7 @@
                 <w:noProof/>
                 <w:webHidden/>
               </w:rPr>
-              <w:instrText xml:space="preserve"> PAGEREF _Toc227176349 \h </w:instrText>
+              <w:instrText xml:space="preserve"> PAGEREF _Toc228457213 \h </w:instrText>
             </w:r>
             <w:r>
               <w:rPr>
@@ -4201,7 +4201,7 @@
               <w:lang w:eastAsia="en-GB"/>
             </w:rPr>
           </w:pPr>
-          <w:hyperlink w:anchor="_Toc227176350" w:history="1">
+          <w:hyperlink w:anchor="_Toc228457214" w:history="1">
             <w:r>
               <w:rPr>
                 <w:rStyle w:val="Hyperlink"/>
@@ -4232,7 +4232,7 @@
                 <w:noProof/>
                 <w:webHidden/>
               </w:rPr>
-              <w:instrText xml:space="preserve"> PAGEREF _Toc227176350 \h </w:instrText>
+              <w:instrText xml:space="preserve"> PAGEREF _Toc228457214 \h </w:instrText>
             </w:r>
             <w:r>
               <w:rPr>
@@ -4279,7 +4279,7 @@
               <w:lang w:eastAsia="en-GB"/>
             </w:rPr>
           </w:pPr>
-          <w:hyperlink w:anchor="_Toc227176351" w:history="1">
+          <w:hyperlink w:anchor="_Toc228457215" w:history="1">
             <w:r>
               <w:rPr>
                 <w:rStyle w:val="Hyperlink"/>
@@ -4310,7 +4310,7 @@
                 <w:noProof/>
                 <w:webHidden/>
               </w:rPr>
-              <w:instrText xml:space="preserve"> PAGEREF _Toc227176351 \h </w:instrText>
+              <w:instrText xml:space="preserve"> PAGEREF _Toc228457215 \h </w:instrText>
             </w:r>
             <w:r>
               <w:rPr>
@@ -4357,7 +4357,7 @@
               <w:lang w:eastAsia="en-GB"/>
             </w:rPr>
           </w:pPr>
-          <w:hyperlink w:anchor="_Toc227176352" w:history="1">
+          <w:hyperlink w:anchor="_Toc228457216" w:history="1">
             <w:r>
               <w:rPr>
                 <w:rStyle w:val="Hyperlink"/>
@@ -4388,7 +4388,7 @@
                 <w:noProof/>
                 <w:webHidden/>
               </w:rPr>
-              <w:instrText xml:space="preserve"> PAGEREF _Toc227176352 \h </w:instrText>
+              <w:instrText xml:space="preserve"> PAGEREF _Toc228457216 \h </w:instrText>
             </w:r>
             <w:r>
               <w:rPr>
@@ -4435,7 +4435,7 @@
               <w:lang w:eastAsia="en-GB"/>
             </w:rPr>
           </w:pPr>
-          <w:hyperlink w:anchor="_Toc227176353" w:history="1">
+          <w:hyperlink w:anchor="_Toc228457217" w:history="1">
             <w:r>
               <w:rPr>
                 <w:rStyle w:val="Hyperlink"/>
@@ -4466,7 +4466,7 @@
                 <w:noProof/>
                 <w:webHidden/>
               </w:rPr>
-              <w:instrText xml:space="preserve"> PAGEREF _Toc227176353 \h </w:instrText>
+              <w:instrText xml:space="preserve"> PAGEREF _Toc228457217 \h </w:instrText>
             </w:r>
             <w:r>
               <w:rPr>
@@ -4513,7 +4513,7 @@
               <w:lang w:eastAsia="en-GB"/>
             </w:rPr>
           </w:pPr>
-          <w:hyperlink w:anchor="_Toc227176354" w:history="1">
+          <w:hyperlink w:anchor="_Toc228457218" w:history="1">
             <w:r>
               <w:rPr>
                 <w:rStyle w:val="Hyperlink"/>
@@ -4544,7 +4544,7 @@
                 <w:noProof/>
                 <w:webHidden/>
               </w:rPr>
-              <w:instrText xml:space="preserve"> PAGEREF _Toc227176354 \h </w:instrText>
+              <w:instrText xml:space="preserve"> PAGEREF _Toc228457218 \h </w:instrText>
             </w:r>
             <w:r>
               <w:rPr>
@@ -4591,7 +4591,7 @@
               <w:lang w:eastAsia="en-GB"/>
             </w:rPr>
           </w:pPr>
-          <w:hyperlink w:anchor="_Toc227176355" w:history="1">
+          <w:hyperlink w:anchor="_Toc228457219" w:history="1">
             <w:r>
               <w:rPr>
                 <w:rStyle w:val="Hyperlink"/>
@@ -4622,7 +4622,7 @@
                 <w:noProof/>
                 <w:webHidden/>
               </w:rPr>
-              <w:instrText xml:space="preserve"> PAGEREF _Toc227176355 \h </w:instrText>
+              <w:instrText xml:space="preserve"> PAGEREF _Toc228457219 \h </w:instrText>
             </w:r>
             <w:r>
               <w:rPr>
@@ -4669,7 +4669,7 @@
               <w:lang w:eastAsia="en-GB"/>
             </w:rPr>
           </w:pPr>
-          <w:hyperlink w:anchor="_Toc227176356" w:history="1">
+          <w:hyperlink w:anchor="_Toc228457220" w:history="1">
             <w:r>
               <w:rPr>
                 <w:rStyle w:val="Hyperlink"/>
@@ -4700,7 +4700,7 @@
                 <w:noProof/>
                 <w:webHidden/>
               </w:rPr>
-              <w:instrText xml:space="preserve"> PAGEREF _Toc227176356 \h </w:instrText>
+              <w:instrText xml:space="preserve"> PAGEREF _Toc228457220 \h </w:instrText>
             </w:r>
             <w:r>
               <w:rPr>
@@ -4747,7 +4747,7 @@
               <w:lang w:eastAsia="en-GB"/>
             </w:rPr>
           </w:pPr>
-          <w:hyperlink w:anchor="_Toc227176357" w:history="1">
+          <w:hyperlink w:anchor="_Toc228457221" w:history="1">
             <w:r>
               <w:rPr>
                 <w:rStyle w:val="Hyperlink"/>
@@ -4778,7 +4778,7 @@
                 <w:noProof/>
                 <w:webHidden/>
               </w:rPr>
-              <w:instrText xml:space="preserve"> PAGEREF _Toc227176357 \h </w:instrText>
+              <w:instrText xml:space="preserve"> PAGEREF _Toc228457221 \h </w:instrText>
             </w:r>
             <w:r>
               <w:rPr>
@@ -4825,7 +4825,7 @@
               <w:lang w:eastAsia="en-GB"/>
             </w:rPr>
           </w:pPr>
-          <w:hyperlink w:anchor="_Toc227176358" w:history="1">
+          <w:hyperlink w:anchor="_Toc228457222" w:history="1">
             <w:r>
               <w:rPr>
                 <w:rStyle w:val="Hyperlink"/>
@@ -4856,7 +4856,7 @@
                 <w:noProof/>
                 <w:webHidden/>
               </w:rPr>
-              <w:instrText xml:space="preserve"> PAGEREF _Toc227176358 \h </w:instrText>
+              <w:instrText xml:space="preserve"> PAGEREF _Toc228457222 \h </w:instrText>
             </w:r>
             <w:r>
               <w:rPr>
@@ -4903,7 +4903,7 @@
               <w:lang w:eastAsia="en-GB"/>
             </w:rPr>
           </w:pPr>
-          <w:hyperlink w:anchor="_Toc227176359" w:history="1">
+          <w:hyperlink w:anchor="_Toc228457223" w:history="1">
             <w:r>
               <w:rPr>
                 <w:rStyle w:val="Hyperlink"/>
@@ -4934,7 +4934,7 @@
                 <w:noProof/>
                 <w:webHidden/>
               </w:rPr>
-              <w:instrText xml:space="preserve"> PAGEREF _Toc227176359 \h </w:instrText>
+              <w:instrText xml:space="preserve"> PAGEREF _Toc228457223 \h </w:instrText>
             </w:r>
             <w:r>
               <w:rPr>
@@ -4981,7 +4981,7 @@
               <w:lang w:eastAsia="en-GB"/>
             </w:rPr>
           </w:pPr>
-          <w:hyperlink w:anchor="_Toc227176360" w:history="1">
+          <w:hyperlink w:anchor="_Toc228457224" w:history="1">
             <w:r>
               <w:rPr>
                 <w:rStyle w:val="Hyperlink"/>
@@ -5012,7 +5012,7 @@
                 <w:noProof/>
                 <w:webHidden/>
               </w:rPr>
-              <w:instrText xml:space="preserve"> PAGEREF _Toc227176360 \h </w:instrText>
+              <w:instrText xml:space="preserve"> PAGEREF _Toc228457224 \h </w:instrText>
             </w:r>
             <w:r>
               <w:rPr>
@@ -5059,7 +5059,7 @@
               <w:lang w:eastAsia="en-GB"/>
             </w:rPr>
           </w:pPr>
-          <w:hyperlink w:anchor="_Toc227176361" w:history="1">
+          <w:hyperlink w:anchor="_Toc228457225" w:history="1">
             <w:r>
               <w:rPr>
                 <w:rStyle w:val="Hyperlink"/>
@@ -5090,7 +5090,7 @@
                 <w:noProof/>
                 <w:webHidden/>
               </w:rPr>
-              <w:instrText xml:space="preserve"> PAGEREF _Toc227176361 \h </w:instrText>
+              <w:instrText xml:space="preserve"> PAGEREF _Toc228457225 \h </w:instrText>
             </w:r>
             <w:r>
               <w:rPr>
@@ -5137,7 +5137,7 @@
               <w:lang w:eastAsia="en-GB"/>
             </w:rPr>
           </w:pPr>
-          <w:hyperlink w:anchor="_Toc227176362" w:history="1">
+          <w:hyperlink w:anchor="_Toc228457226" w:history="1">
             <w:r>
               <w:rPr>
                 <w:rStyle w:val="Hyperlink"/>
@@ -5168,7 +5168,7 @@
                 <w:noProof/>
                 <w:webHidden/>
               </w:rPr>
-              <w:instrText xml:space="preserve"> PAGEREF _Toc227176362 \h </w:instrText>
+              <w:instrText xml:space="preserve"> PAGEREF _Toc228457226 \h </w:instrText>
             </w:r>
             <w:r>
               <w:rPr>
@@ -5215,7 +5215,7 @@
               <w:lang w:eastAsia="en-GB"/>
             </w:rPr>
           </w:pPr>
-          <w:hyperlink w:anchor="_Toc227176363" w:history="1">
+          <w:hyperlink w:anchor="_Toc228457227" w:history="1">
             <w:r>
               <w:rPr>
                 <w:rStyle w:val="Hyperlink"/>
@@ -5246,7 +5246,7 @@
                 <w:noProof/>
                 <w:webHidden/>
               </w:rPr>
-              <w:instrText xml:space="preserve"> PAGEREF _Toc227176363 \h </w:instrText>
+              <w:instrText xml:space="preserve"> PAGEREF _Toc228457227 \h </w:instrText>
             </w:r>
             <w:r>
               <w:rPr>
@@ -5293,7 +5293,7 @@
               <w:lang w:eastAsia="en-GB"/>
             </w:rPr>
           </w:pPr>
-          <w:hyperlink w:anchor="_Toc227176364" w:history="1">
+          <w:hyperlink w:anchor="_Toc228457228" w:history="1">
             <w:r>
               <w:rPr>
                 <w:rStyle w:val="Hyperlink"/>
@@ -5324,7 +5324,7 @@
                 <w:noProof/>
                 <w:webHidden/>
               </w:rPr>
-              <w:instrText xml:space="preserve"> PAGEREF _Toc227176364 \h </w:instrText>
+              <w:instrText xml:space="preserve"> PAGEREF _Toc228457228 \h </w:instrText>
             </w:r>
             <w:r>
               <w:rPr>
@@ -5371,7 +5371,7 @@
               <w:lang w:eastAsia="en-GB"/>
             </w:rPr>
           </w:pPr>
-          <w:hyperlink w:anchor="_Toc227176365" w:history="1">
+          <w:hyperlink w:anchor="_Toc228457229" w:history="1">
             <w:r>
               <w:rPr>
                 <w:rStyle w:val="Hyperlink"/>
@@ -5402,7 +5402,7 @@
                 <w:noProof/>
                 <w:webHidden/>
               </w:rPr>
-              <w:instrText xml:space="preserve"> PAGEREF _Toc227176365 \h </w:instrText>
+              <w:instrText xml:space="preserve"> PAGEREF _Toc228457229 \h </w:instrText>
             </w:r>
             <w:r>
               <w:rPr>
@@ -5449,7 +5449,7 @@
               <w:lang w:eastAsia="en-GB"/>
             </w:rPr>
           </w:pPr>
-          <w:hyperlink w:anchor="_Toc227176366" w:history="1">
+          <w:hyperlink w:anchor="_Toc228457230" w:history="1">
             <w:r>
               <w:rPr>
                 <w:rStyle w:val="Hyperlink"/>
@@ -5480,7 +5480,7 @@
                 <w:noProof/>
                 <w:webHidden/>
               </w:rPr>
-              <w:instrText xml:space="preserve"> PAGEREF _Toc227176366 \h </w:instrText>
+              <w:instrText xml:space="preserve"> PAGEREF _Toc228457230 \h </w:instrText>
             </w:r>
             <w:r>
               <w:rPr>
@@ -5527,7 +5527,7 @@
               <w:lang w:eastAsia="en-GB"/>
             </w:rPr>
           </w:pPr>
-          <w:hyperlink w:anchor="_Toc227176367" w:history="1">
+          <w:hyperlink w:anchor="_Toc228457231" w:history="1">
             <w:r>
               <w:rPr>
                 <w:rStyle w:val="Hyperlink"/>
@@ -5558,7 +5558,7 @@
                 <w:noProof/>
                 <w:webHidden/>
               </w:rPr>
-              <w:instrText xml:space="preserve"> PAGEREF _Toc227176367 \h </w:instrText>
+              <w:instrText xml:space="preserve"> PAGEREF _Toc228457231 \h </w:instrText>
             </w:r>
             <w:r>
               <w:rPr>
@@ -5605,7 +5605,7 @@
               <w:lang w:eastAsia="en-GB"/>
             </w:rPr>
           </w:pPr>
-          <w:hyperlink w:anchor="_Toc227176368" w:history="1">
+          <w:hyperlink w:anchor="_Toc228457232" w:history="1">
             <w:r>
               <w:rPr>
                 <w:rStyle w:val="Hyperlink"/>
@@ -5636,7 +5636,7 @@
                 <w:noProof/>
                 <w:webHidden/>
               </w:rPr>
-              <w:instrText xml:space="preserve"> PAGEREF _Toc227176368 \h </w:instrText>
+              <w:instrText xml:space="preserve"> PAGEREF _Toc228457232 \h </w:instrText>
             </w:r>
             <w:r>
               <w:rPr>
@@ -5683,7 +5683,7 @@
               <w:lang w:eastAsia="en-GB"/>
             </w:rPr>
           </w:pPr>
-          <w:hyperlink w:anchor="_Toc227176369" w:history="1">
+          <w:hyperlink w:anchor="_Toc228457233" w:history="1">
             <w:r>
               <w:rPr>
                 <w:rStyle w:val="Hyperlink"/>
@@ -5714,7 +5714,7 @@
                 <w:noProof/>
                 <w:webHidden/>
               </w:rPr>
-              <w:instrText xml:space="preserve"> PAGEREF _Toc227176369 \h </w:instrText>
+              <w:instrText xml:space="preserve"> PAGEREF _Toc228457233 \h </w:instrText>
             </w:r>
             <w:r>
               <w:rPr>
@@ -5761,7 +5761,7 @@
               <w:lang w:eastAsia="en-GB"/>
             </w:rPr>
           </w:pPr>
-          <w:hyperlink w:anchor="_Toc227176370" w:history="1">
+          <w:hyperlink w:anchor="_Toc228457234" w:history="1">
             <w:r>
               <w:rPr>
                 <w:rStyle w:val="Hyperlink"/>
@@ -5792,7 +5792,7 @@
                 <w:noProof/>
                 <w:webHidden/>
               </w:rPr>
-              <w:instrText xml:space="preserve"> PAGEREF _Toc227176370 \h </w:instrText>
+              <w:instrText xml:space="preserve"> PAGEREF _Toc228457234 \h </w:instrText>
             </w:r>
             <w:r>
               <w:rPr>
@@ -5839,7 +5839,7 @@
               <w:lang w:eastAsia="en-GB"/>
             </w:rPr>
           </w:pPr>
-          <w:hyperlink w:anchor="_Toc227176371" w:history="1">
+          <w:hyperlink w:anchor="_Toc228457235" w:history="1">
             <w:r>
               <w:rPr>
                 <w:rStyle w:val="Hyperlink"/>
@@ -5870,7 +5870,7 @@
                 <w:noProof/>
                 <w:webHidden/>
               </w:rPr>
-              <w:instrText xml:space="preserve"> PAGEREF _Toc227176371 \h </w:instrText>
+              <w:instrText xml:space="preserve"> PAGEREF _Toc228457235 \h </w:instrText>
             </w:r>
             <w:r>
               <w:rPr>
@@ -5917,7 +5917,7 @@
               <w:lang w:eastAsia="en-GB"/>
             </w:rPr>
           </w:pPr>
-          <w:hyperlink w:anchor="_Toc227176372" w:history="1">
+          <w:hyperlink w:anchor="_Toc228457236" w:history="1">
             <w:r>
               <w:rPr>
                 <w:rStyle w:val="Hyperlink"/>
@@ -5948,7 +5948,7 @@
                 <w:noProof/>
                 <w:webHidden/>
               </w:rPr>
-              <w:instrText xml:space="preserve"> PAGEREF _Toc227176372 \h </w:instrText>
+              <w:instrText xml:space="preserve"> PAGEREF _Toc228457236 \h </w:instrText>
             </w:r>
             <w:r>
               <w:rPr>
@@ -5995,7 +5995,7 @@
               <w:lang w:eastAsia="en-GB"/>
             </w:rPr>
           </w:pPr>
-          <w:hyperlink w:anchor="_Toc227176373" w:history="1">
+          <w:hyperlink w:anchor="_Toc228457237" w:history="1">
             <w:r>
               <w:rPr>
                 <w:rStyle w:val="Hyperlink"/>
@@ -6026,7 +6026,7 @@
                 <w:noProof/>
                 <w:webHidden/>
               </w:rPr>
-              <w:instrText xml:space="preserve"> PAGEREF _Toc227176373 \h </w:instrText>
+              <w:instrText xml:space="preserve"> PAGEREF _Toc228457237 \h </w:instrText>
             </w:r>
             <w:r>
               <w:rPr>
@@ -6073,7 +6073,7 @@
               <w:lang w:eastAsia="en-GB"/>
             </w:rPr>
           </w:pPr>
-          <w:hyperlink w:anchor="_Toc227176374" w:history="1">
+          <w:hyperlink w:anchor="_Toc228457238" w:history="1">
             <w:r>
               <w:rPr>
                 <w:rStyle w:val="Hyperlink"/>
@@ -6104,7 +6104,7 @@
                 <w:noProof/>
                 <w:webHidden/>
               </w:rPr>
-              <w:instrText xml:space="preserve"> PAGEREF _Toc227176374 \h </w:instrText>
+              <w:instrText xml:space="preserve"> PAGEREF _Toc228457238 \h </w:instrText>
             </w:r>
             <w:r>
               <w:rPr>
@@ -6151,7 +6151,7 @@
               <w:lang w:eastAsia="en-GB"/>
             </w:rPr>
           </w:pPr>
-          <w:hyperlink w:anchor="_Toc227176375" w:history="1">
+          <w:hyperlink w:anchor="_Toc228457239" w:history="1">
             <w:r>
               <w:rPr>
                 <w:rStyle w:val="Hyperlink"/>
@@ -6182,7 +6182,7 @@
                 <w:noProof/>
                 <w:webHidden/>
               </w:rPr>
-              <w:instrText xml:space="preserve"> PAGEREF _Toc227176375 \h </w:instrText>
+              <w:instrText xml:space="preserve"> PAGEREF _Toc228457239 \h </w:instrText>
             </w:r>
             <w:r>
               <w:rPr>
@@ -6229,7 +6229,7 @@
               <w:lang w:eastAsia="en-GB"/>
             </w:rPr>
           </w:pPr>
-          <w:hyperlink w:anchor="_Toc227176376" w:history="1">
+          <w:hyperlink w:anchor="_Toc228457240" w:history="1">
             <w:r>
               <w:rPr>
                 <w:rStyle w:val="Hyperlink"/>
@@ -6260,7 +6260,7 @@
                 <w:noProof/>
                 <w:webHidden/>
               </w:rPr>
-              <w:instrText xml:space="preserve"> PAGEREF _Toc227176376 \h </w:instrText>
+              <w:instrText xml:space="preserve"> PAGEREF _Toc228457240 \h </w:instrText>
             </w:r>
             <w:r>
               <w:rPr>
@@ -6307,7 +6307,7 @@
               <w:lang w:eastAsia="en-GB"/>
             </w:rPr>
           </w:pPr>
-          <w:hyperlink w:anchor="_Toc227176377" w:history="1">
+          <w:hyperlink w:anchor="_Toc228457241" w:history="1">
             <w:r>
               <w:rPr>
                 <w:rStyle w:val="Hyperlink"/>
@@ -6338,7 +6338,7 @@
                 <w:noProof/>
                 <w:webHidden/>
               </w:rPr>
-              <w:instrText xml:space="preserve"> PAGEREF _Toc227176377 \h </w:instrText>
+              <w:instrText xml:space="preserve"> PAGEREF _Toc228457241 \h </w:instrText>
             </w:r>
             <w:r>
               <w:rPr>
@@ -6385,7 +6385,7 @@
               <w:lang w:eastAsia="en-GB"/>
             </w:rPr>
           </w:pPr>
-          <w:hyperlink w:anchor="_Toc227176378" w:history="1">
+          <w:hyperlink w:anchor="_Toc228457242" w:history="1">
             <w:r>
               <w:rPr>
                 <w:rStyle w:val="Hyperlink"/>
@@ -6416,7 +6416,7 @@
                 <w:noProof/>
                 <w:webHidden/>
               </w:rPr>
-              <w:instrText xml:space="preserve"> PAGEREF _Toc227176378 \h </w:instrText>
+              <w:instrText xml:space="preserve"> PAGEREF _Toc228457242 \h </w:instrText>
             </w:r>
             <w:r>
               <w:rPr>
@@ -6463,7 +6463,7 @@
               <w:lang w:eastAsia="en-GB"/>
             </w:rPr>
           </w:pPr>
-          <w:hyperlink w:anchor="_Toc227176379" w:history="1">
+          <w:hyperlink w:anchor="_Toc228457243" w:history="1">
             <w:r>
               <w:rPr>
                 <w:rStyle w:val="Hyperlink"/>
@@ -6494,7 +6494,7 @@
                 <w:noProof/>
                 <w:webHidden/>
               </w:rPr>
-              <w:instrText xml:space="preserve"> PAGEREF _Toc227176379 \h </w:instrText>
+              <w:instrText xml:space="preserve"> PAGEREF _Toc228457243 \h </w:instrText>
             </w:r>
             <w:r>
               <w:rPr>
@@ -6518,6 +6518,864 @@
                 <w:webHidden/>
               </w:rPr>
               <w:t>13</w:t>
+            </w:r>
+            <w:r>
+              <w:rPr>
+                <w:rFonts w:ascii="Times New Roman" w:hAnsi="Times New Roman" w:cs="Times New Roman"/>
+                <w:noProof/>
+                <w:webHidden/>
+              </w:rPr>
+              <w:fldChar w:fldCharType="end"/>
+            </w:r>
+          </w:hyperlink>
+        </w:p>
+        <w:p>
+          <w:pPr>
+            <w:pStyle w:val="TOC3"/>
+            <w:tabs>
+              <w:tab w:val="right" w:leader="dot" w:pos="9016"/>
+            </w:tabs>
+            <w:rPr>
+              <w:rFonts w:ascii="Times New Roman" w:eastAsiaTheme="minorEastAsia" w:hAnsi="Times New Roman" w:cs="Times New Roman"/>
+              <w:noProof/>
+              <w:lang w:eastAsia="en-GB"/>
+            </w:rPr>
+          </w:pPr>
+          <w:hyperlink w:anchor="_Toc228457244" w:history="1">
+            <w:r>
+              <w:rPr>
+                <w:rStyle w:val="Hyperlink"/>
+                <w:rFonts w:ascii="Times New Roman" w:hAnsi="Times New Roman" w:cs="Times New Roman"/>
+                <w:noProof/>
+              </w:rPr>
+              <w:t>Feature 1 - User Authentication</w:t>
+            </w:r>
+            <w:r>
+              <w:rPr>
+                <w:rFonts w:ascii="Times New Roman" w:hAnsi="Times New Roman" w:cs="Times New Roman"/>
+                <w:noProof/>
+                <w:webHidden/>
+              </w:rPr>
+              <w:tab/>
+            </w:r>
+            <w:r>
+              <w:rPr>
+                <w:rFonts w:ascii="Times New Roman" w:hAnsi="Times New Roman" w:cs="Times New Roman"/>
+                <w:noProof/>
+                <w:webHidden/>
+              </w:rPr>
+              <w:fldChar w:fldCharType="begin"/>
+            </w:r>
+            <w:r>
+              <w:rPr>
+                <w:rFonts w:ascii="Times New Roman" w:hAnsi="Times New Roman" w:cs="Times New Roman"/>
+                <w:noProof/>
+                <w:webHidden/>
+              </w:rPr>
+              <w:instrText xml:space="preserve"> PAGEREF _Toc228457244 \h </w:instrText>
+            </w:r>
+            <w:r>
+              <w:rPr>
+                <w:rFonts w:ascii="Times New Roman" w:hAnsi="Times New Roman" w:cs="Times New Roman"/>
+                <w:noProof/>
+                <w:webHidden/>
+              </w:rPr>
+            </w:r>
+            <w:r>
+              <w:rPr>
+                <w:rFonts w:ascii="Times New Roman" w:hAnsi="Times New Roman" w:cs="Times New Roman"/>
+                <w:noProof/>
+                <w:webHidden/>
+              </w:rPr>
+              <w:fldChar w:fldCharType="separate"/>
+            </w:r>
+            <w:r>
+              <w:rPr>
+                <w:rFonts w:ascii="Times New Roman" w:hAnsi="Times New Roman" w:cs="Times New Roman"/>
+                <w:noProof/>
+                <w:webHidden/>
+              </w:rPr>
+              <w:t>13</w:t>
+            </w:r>
+            <w:r>
+              <w:rPr>
+                <w:rFonts w:ascii="Times New Roman" w:hAnsi="Times New Roman" w:cs="Times New Roman"/>
+                <w:noProof/>
+                <w:webHidden/>
+              </w:rPr>
+              <w:fldChar w:fldCharType="end"/>
+            </w:r>
+          </w:hyperlink>
+        </w:p>
+        <w:p>
+          <w:pPr>
+            <w:pStyle w:val="TOC3"/>
+            <w:tabs>
+              <w:tab w:val="right" w:leader="dot" w:pos="9016"/>
+            </w:tabs>
+            <w:rPr>
+              <w:rFonts w:ascii="Times New Roman" w:eastAsiaTheme="minorEastAsia" w:hAnsi="Times New Roman" w:cs="Times New Roman"/>
+              <w:noProof/>
+              <w:lang w:eastAsia="en-GB"/>
+            </w:rPr>
+          </w:pPr>
+          <w:hyperlink w:anchor="_Toc228457245" w:history="1">
+            <w:r>
+              <w:rPr>
+                <w:rStyle w:val="Hyperlink"/>
+                <w:rFonts w:ascii="Times New Roman" w:hAnsi="Times New Roman" w:cs="Times New Roman"/>
+                <w:noProof/>
+              </w:rPr>
+              <w:t>Feature 2 - Live Parking Map</w:t>
+            </w:r>
+            <w:r>
+              <w:rPr>
+                <w:rFonts w:ascii="Times New Roman" w:hAnsi="Times New Roman" w:cs="Times New Roman"/>
+                <w:noProof/>
+                <w:webHidden/>
+              </w:rPr>
+              <w:tab/>
+            </w:r>
+            <w:r>
+              <w:rPr>
+                <w:rFonts w:ascii="Times New Roman" w:hAnsi="Times New Roman" w:cs="Times New Roman"/>
+                <w:noProof/>
+                <w:webHidden/>
+              </w:rPr>
+              <w:fldChar w:fldCharType="begin"/>
+            </w:r>
+            <w:r>
+              <w:rPr>
+                <w:rFonts w:ascii="Times New Roman" w:hAnsi="Times New Roman" w:cs="Times New Roman"/>
+                <w:noProof/>
+                <w:webHidden/>
+              </w:rPr>
+              <w:instrText xml:space="preserve"> PAGEREF _Toc228457245 \h </w:instrText>
+            </w:r>
+            <w:r>
+              <w:rPr>
+                <w:rFonts w:ascii="Times New Roman" w:hAnsi="Times New Roman" w:cs="Times New Roman"/>
+                <w:noProof/>
+                <w:webHidden/>
+              </w:rPr>
+            </w:r>
+            <w:r>
+              <w:rPr>
+                <w:rFonts w:ascii="Times New Roman" w:hAnsi="Times New Roman" w:cs="Times New Roman"/>
+                <w:noProof/>
+                <w:webHidden/>
+              </w:rPr>
+              <w:fldChar w:fldCharType="separate"/>
+            </w:r>
+            <w:r>
+              <w:rPr>
+                <w:rFonts w:ascii="Times New Roman" w:hAnsi="Times New Roman" w:cs="Times New Roman"/>
+                <w:noProof/>
+                <w:webHidden/>
+              </w:rPr>
+              <w:t>13</w:t>
+            </w:r>
+            <w:r>
+              <w:rPr>
+                <w:rFonts w:ascii="Times New Roman" w:hAnsi="Times New Roman" w:cs="Times New Roman"/>
+                <w:noProof/>
+                <w:webHidden/>
+              </w:rPr>
+              <w:fldChar w:fldCharType="end"/>
+            </w:r>
+          </w:hyperlink>
+        </w:p>
+        <w:p>
+          <w:pPr>
+            <w:pStyle w:val="TOC3"/>
+            <w:tabs>
+              <w:tab w:val="right" w:leader="dot" w:pos="9016"/>
+            </w:tabs>
+            <w:rPr>
+              <w:rFonts w:ascii="Times New Roman" w:eastAsiaTheme="minorEastAsia" w:hAnsi="Times New Roman" w:cs="Times New Roman"/>
+              <w:noProof/>
+              <w:lang w:eastAsia="en-GB"/>
+            </w:rPr>
+          </w:pPr>
+          <w:hyperlink w:anchor="_Toc228457246" w:history="1">
+            <w:r>
+              <w:rPr>
+                <w:rStyle w:val="Hyperlink"/>
+                <w:rFonts w:ascii="Times New Roman" w:hAnsi="Times New Roman" w:cs="Times New Roman"/>
+                <w:noProof/>
+              </w:rPr>
+              <w:t>Feature 3 - Digital Reservation</w:t>
+            </w:r>
+            <w:r>
+              <w:rPr>
+                <w:rFonts w:ascii="Times New Roman" w:hAnsi="Times New Roman" w:cs="Times New Roman"/>
+                <w:noProof/>
+                <w:webHidden/>
+              </w:rPr>
+              <w:tab/>
+            </w:r>
+            <w:r>
+              <w:rPr>
+                <w:rFonts w:ascii="Times New Roman" w:hAnsi="Times New Roman" w:cs="Times New Roman"/>
+                <w:noProof/>
+                <w:webHidden/>
+              </w:rPr>
+              <w:fldChar w:fldCharType="begin"/>
+            </w:r>
+            <w:r>
+              <w:rPr>
+                <w:rFonts w:ascii="Times New Roman" w:hAnsi="Times New Roman" w:cs="Times New Roman"/>
+                <w:noProof/>
+                <w:webHidden/>
+              </w:rPr>
+              <w:instrText xml:space="preserve"> PAGEREF _Toc228457246 \h </w:instrText>
+            </w:r>
+            <w:r>
+              <w:rPr>
+                <w:rFonts w:ascii="Times New Roman" w:hAnsi="Times New Roman" w:cs="Times New Roman"/>
+                <w:noProof/>
+                <w:webHidden/>
+              </w:rPr>
+            </w:r>
+            <w:r>
+              <w:rPr>
+                <w:rFonts w:ascii="Times New Roman" w:hAnsi="Times New Roman" w:cs="Times New Roman"/>
+                <w:noProof/>
+                <w:webHidden/>
+              </w:rPr>
+              <w:fldChar w:fldCharType="separate"/>
+            </w:r>
+            <w:r>
+              <w:rPr>
+                <w:rFonts w:ascii="Times New Roman" w:hAnsi="Times New Roman" w:cs="Times New Roman"/>
+                <w:noProof/>
+                <w:webHidden/>
+              </w:rPr>
+              <w:t>14</w:t>
+            </w:r>
+            <w:r>
+              <w:rPr>
+                <w:rFonts w:ascii="Times New Roman" w:hAnsi="Times New Roman" w:cs="Times New Roman"/>
+                <w:noProof/>
+                <w:webHidden/>
+              </w:rPr>
+              <w:fldChar w:fldCharType="end"/>
+            </w:r>
+          </w:hyperlink>
+        </w:p>
+        <w:p>
+          <w:pPr>
+            <w:pStyle w:val="TOC3"/>
+            <w:tabs>
+              <w:tab w:val="right" w:leader="dot" w:pos="9016"/>
+            </w:tabs>
+            <w:rPr>
+              <w:rFonts w:ascii="Times New Roman" w:eastAsiaTheme="minorEastAsia" w:hAnsi="Times New Roman" w:cs="Times New Roman"/>
+              <w:noProof/>
+              <w:lang w:eastAsia="en-GB"/>
+            </w:rPr>
+          </w:pPr>
+          <w:hyperlink w:anchor="_Toc228457247" w:history="1">
+            <w:r>
+              <w:rPr>
+                <w:rStyle w:val="Hyperlink"/>
+                <w:rFonts w:ascii="Times New Roman" w:hAnsi="Times New Roman" w:cs="Times New Roman"/>
+                <w:noProof/>
+              </w:rPr>
+              <w:t>Feature 4 - Capacity and Peak Time Analytics</w:t>
+            </w:r>
+            <w:r>
+              <w:rPr>
+                <w:rFonts w:ascii="Times New Roman" w:hAnsi="Times New Roman" w:cs="Times New Roman"/>
+                <w:noProof/>
+                <w:webHidden/>
+              </w:rPr>
+              <w:tab/>
+            </w:r>
+            <w:r>
+              <w:rPr>
+                <w:rFonts w:ascii="Times New Roman" w:hAnsi="Times New Roman" w:cs="Times New Roman"/>
+                <w:noProof/>
+                <w:webHidden/>
+              </w:rPr>
+              <w:fldChar w:fldCharType="begin"/>
+            </w:r>
+            <w:r>
+              <w:rPr>
+                <w:rFonts w:ascii="Times New Roman" w:hAnsi="Times New Roman" w:cs="Times New Roman"/>
+                <w:noProof/>
+                <w:webHidden/>
+              </w:rPr>
+              <w:instrText xml:space="preserve"> PAGEREF _Toc228457247 \h </w:instrText>
+            </w:r>
+            <w:r>
+              <w:rPr>
+                <w:rFonts w:ascii="Times New Roman" w:hAnsi="Times New Roman" w:cs="Times New Roman"/>
+                <w:noProof/>
+                <w:webHidden/>
+              </w:rPr>
+            </w:r>
+            <w:r>
+              <w:rPr>
+                <w:rFonts w:ascii="Times New Roman" w:hAnsi="Times New Roman" w:cs="Times New Roman"/>
+                <w:noProof/>
+                <w:webHidden/>
+              </w:rPr>
+              <w:fldChar w:fldCharType="separate"/>
+            </w:r>
+            <w:r>
+              <w:rPr>
+                <w:rFonts w:ascii="Times New Roman" w:hAnsi="Times New Roman" w:cs="Times New Roman"/>
+                <w:noProof/>
+                <w:webHidden/>
+              </w:rPr>
+              <w:t>15</w:t>
+            </w:r>
+            <w:r>
+              <w:rPr>
+                <w:rFonts w:ascii="Times New Roman" w:hAnsi="Times New Roman" w:cs="Times New Roman"/>
+                <w:noProof/>
+                <w:webHidden/>
+              </w:rPr>
+              <w:fldChar w:fldCharType="end"/>
+            </w:r>
+          </w:hyperlink>
+        </w:p>
+        <w:p>
+          <w:pPr>
+            <w:pStyle w:val="TOC1"/>
+            <w:tabs>
+              <w:tab w:val="right" w:leader="dot" w:pos="9016"/>
+            </w:tabs>
+            <w:rPr>
+              <w:rFonts w:ascii="Times New Roman" w:eastAsiaTheme="minorEastAsia" w:hAnsi="Times New Roman" w:cs="Times New Roman"/>
+              <w:noProof/>
+              <w:lang w:eastAsia="en-GB"/>
+            </w:rPr>
+          </w:pPr>
+          <w:hyperlink w:anchor="_Toc228457248" w:history="1">
+            <w:r>
+              <w:rPr>
+                <w:rStyle w:val="Hyperlink"/>
+                <w:rFonts w:ascii="Times New Roman" w:hAnsi="Times New Roman" w:cs="Times New Roman"/>
+                <w:noProof/>
+              </w:rPr>
+              <w:t>Use Case Diagram</w:t>
+            </w:r>
+            <w:r>
+              <w:rPr>
+                <w:rFonts w:ascii="Times New Roman" w:hAnsi="Times New Roman" w:cs="Times New Roman"/>
+                <w:noProof/>
+                <w:webHidden/>
+              </w:rPr>
+              <w:tab/>
+            </w:r>
+            <w:r>
+              <w:rPr>
+                <w:rFonts w:ascii="Times New Roman" w:hAnsi="Times New Roman" w:cs="Times New Roman"/>
+                <w:noProof/>
+                <w:webHidden/>
+              </w:rPr>
+              <w:fldChar w:fldCharType="begin"/>
+            </w:r>
+            <w:r>
+              <w:rPr>
+                <w:rFonts w:ascii="Times New Roman" w:hAnsi="Times New Roman" w:cs="Times New Roman"/>
+                <w:noProof/>
+                <w:webHidden/>
+              </w:rPr>
+              <w:instrText xml:space="preserve"> PAGEREF _Toc228457248 \h </w:instrText>
+            </w:r>
+            <w:r>
+              <w:rPr>
+                <w:rFonts w:ascii="Times New Roman" w:hAnsi="Times New Roman" w:cs="Times New Roman"/>
+                <w:noProof/>
+                <w:webHidden/>
+              </w:rPr>
+            </w:r>
+            <w:r>
+              <w:rPr>
+                <w:rFonts w:ascii="Times New Roman" w:hAnsi="Times New Roman" w:cs="Times New Roman"/>
+                <w:noProof/>
+                <w:webHidden/>
+              </w:rPr>
+              <w:fldChar w:fldCharType="separate"/>
+            </w:r>
+            <w:r>
+              <w:rPr>
+                <w:rFonts w:ascii="Times New Roman" w:hAnsi="Times New Roman" w:cs="Times New Roman"/>
+                <w:noProof/>
+                <w:webHidden/>
+              </w:rPr>
+              <w:t>16</w:t>
+            </w:r>
+            <w:r>
+              <w:rPr>
+                <w:rFonts w:ascii="Times New Roman" w:hAnsi="Times New Roman" w:cs="Times New Roman"/>
+                <w:noProof/>
+                <w:webHidden/>
+              </w:rPr>
+              <w:fldChar w:fldCharType="end"/>
+            </w:r>
+          </w:hyperlink>
+        </w:p>
+        <w:p>
+          <w:pPr>
+            <w:pStyle w:val="TOC1"/>
+            <w:tabs>
+              <w:tab w:val="right" w:leader="dot" w:pos="9016"/>
+            </w:tabs>
+            <w:rPr>
+              <w:rFonts w:ascii="Times New Roman" w:eastAsiaTheme="minorEastAsia" w:hAnsi="Times New Roman" w:cs="Times New Roman"/>
+              <w:noProof/>
+              <w:lang w:eastAsia="en-GB"/>
+            </w:rPr>
+          </w:pPr>
+          <w:hyperlink w:anchor="_Toc228457249" w:history="1">
+            <w:r>
+              <w:rPr>
+                <w:rStyle w:val="Hyperlink"/>
+                <w:rFonts w:ascii="Times New Roman" w:hAnsi="Times New Roman" w:cs="Times New Roman"/>
+                <w:noProof/>
+              </w:rPr>
+              <w:t>Activity Diagram</w:t>
+            </w:r>
+            <w:r>
+              <w:rPr>
+                <w:rFonts w:ascii="Times New Roman" w:hAnsi="Times New Roman" w:cs="Times New Roman"/>
+                <w:noProof/>
+                <w:webHidden/>
+              </w:rPr>
+              <w:tab/>
+            </w:r>
+            <w:r>
+              <w:rPr>
+                <w:rFonts w:ascii="Times New Roman" w:hAnsi="Times New Roman" w:cs="Times New Roman"/>
+                <w:noProof/>
+                <w:webHidden/>
+              </w:rPr>
+              <w:fldChar w:fldCharType="begin"/>
+            </w:r>
+            <w:r>
+              <w:rPr>
+                <w:rFonts w:ascii="Times New Roman" w:hAnsi="Times New Roman" w:cs="Times New Roman"/>
+                <w:noProof/>
+                <w:webHidden/>
+              </w:rPr>
+              <w:instrText xml:space="preserve"> PAGEREF _Toc228457249 \h </w:instrText>
+            </w:r>
+            <w:r>
+              <w:rPr>
+                <w:rFonts w:ascii="Times New Roman" w:hAnsi="Times New Roman" w:cs="Times New Roman"/>
+                <w:noProof/>
+                <w:webHidden/>
+              </w:rPr>
+            </w:r>
+            <w:r>
+              <w:rPr>
+                <w:rFonts w:ascii="Times New Roman" w:hAnsi="Times New Roman" w:cs="Times New Roman"/>
+                <w:noProof/>
+                <w:webHidden/>
+              </w:rPr>
+              <w:fldChar w:fldCharType="separate"/>
+            </w:r>
+            <w:r>
+              <w:rPr>
+                <w:rFonts w:ascii="Times New Roman" w:hAnsi="Times New Roman" w:cs="Times New Roman"/>
+                <w:noProof/>
+                <w:webHidden/>
+              </w:rPr>
+              <w:t>17</w:t>
+            </w:r>
+            <w:r>
+              <w:rPr>
+                <w:rFonts w:ascii="Times New Roman" w:hAnsi="Times New Roman" w:cs="Times New Roman"/>
+                <w:noProof/>
+                <w:webHidden/>
+              </w:rPr>
+              <w:fldChar w:fldCharType="end"/>
+            </w:r>
+          </w:hyperlink>
+        </w:p>
+        <w:p>
+          <w:pPr>
+            <w:pStyle w:val="TOC1"/>
+            <w:tabs>
+              <w:tab w:val="right" w:leader="dot" w:pos="9016"/>
+            </w:tabs>
+            <w:rPr>
+              <w:rFonts w:ascii="Times New Roman" w:eastAsiaTheme="minorEastAsia" w:hAnsi="Times New Roman" w:cs="Times New Roman"/>
+              <w:noProof/>
+              <w:lang w:eastAsia="en-GB"/>
+            </w:rPr>
+          </w:pPr>
+          <w:hyperlink w:anchor="_Toc228457250" w:history="1">
+            <w:r>
+              <w:rPr>
+                <w:rStyle w:val="Hyperlink"/>
+                <w:rFonts w:ascii="Times New Roman" w:hAnsi="Times New Roman" w:cs="Times New Roman"/>
+                <w:noProof/>
+              </w:rPr>
+              <w:t>Class Diagram</w:t>
+            </w:r>
+            <w:r>
+              <w:rPr>
+                <w:rFonts w:ascii="Times New Roman" w:hAnsi="Times New Roman" w:cs="Times New Roman"/>
+                <w:noProof/>
+                <w:webHidden/>
+              </w:rPr>
+              <w:tab/>
+            </w:r>
+            <w:r>
+              <w:rPr>
+                <w:rFonts w:ascii="Times New Roman" w:hAnsi="Times New Roman" w:cs="Times New Roman"/>
+                <w:noProof/>
+                <w:webHidden/>
+              </w:rPr>
+              <w:fldChar w:fldCharType="begin"/>
+            </w:r>
+            <w:r>
+              <w:rPr>
+                <w:rFonts w:ascii="Times New Roman" w:hAnsi="Times New Roman" w:cs="Times New Roman"/>
+                <w:noProof/>
+                <w:webHidden/>
+              </w:rPr>
+              <w:instrText xml:space="preserve"> PAGEREF _Toc228457250 \h </w:instrText>
+            </w:r>
+            <w:r>
+              <w:rPr>
+                <w:rFonts w:ascii="Times New Roman" w:hAnsi="Times New Roman" w:cs="Times New Roman"/>
+                <w:noProof/>
+                <w:webHidden/>
+              </w:rPr>
+            </w:r>
+            <w:r>
+              <w:rPr>
+                <w:rFonts w:ascii="Times New Roman" w:hAnsi="Times New Roman" w:cs="Times New Roman"/>
+                <w:noProof/>
+                <w:webHidden/>
+              </w:rPr>
+              <w:fldChar w:fldCharType="separate"/>
+            </w:r>
+            <w:r>
+              <w:rPr>
+                <w:rFonts w:ascii="Times New Roman" w:hAnsi="Times New Roman" w:cs="Times New Roman"/>
+                <w:noProof/>
+                <w:webHidden/>
+              </w:rPr>
+              <w:t>18</w:t>
+            </w:r>
+            <w:r>
+              <w:rPr>
+                <w:rFonts w:ascii="Times New Roman" w:hAnsi="Times New Roman" w:cs="Times New Roman"/>
+                <w:noProof/>
+                <w:webHidden/>
+              </w:rPr>
+              <w:fldChar w:fldCharType="end"/>
+            </w:r>
+          </w:hyperlink>
+        </w:p>
+        <w:p>
+          <w:pPr>
+            <w:pStyle w:val="TOC1"/>
+            <w:tabs>
+              <w:tab w:val="right" w:leader="dot" w:pos="9016"/>
+            </w:tabs>
+            <w:rPr>
+              <w:rFonts w:ascii="Times New Roman" w:eastAsiaTheme="minorEastAsia" w:hAnsi="Times New Roman" w:cs="Times New Roman"/>
+              <w:noProof/>
+              <w:lang w:eastAsia="en-GB"/>
+            </w:rPr>
+          </w:pPr>
+          <w:hyperlink w:anchor="_Toc228457251" w:history="1">
+            <w:r>
+              <w:rPr>
+                <w:rStyle w:val="Hyperlink"/>
+                <w:rFonts w:ascii="Times New Roman" w:hAnsi="Times New Roman" w:cs="Times New Roman"/>
+                <w:noProof/>
+              </w:rPr>
+              <w:t>SETU Park Prototype</w:t>
+            </w:r>
+            <w:r>
+              <w:rPr>
+                <w:rFonts w:ascii="Times New Roman" w:hAnsi="Times New Roman" w:cs="Times New Roman"/>
+                <w:noProof/>
+                <w:webHidden/>
+              </w:rPr>
+              <w:tab/>
+            </w:r>
+            <w:r>
+              <w:rPr>
+                <w:rFonts w:ascii="Times New Roman" w:hAnsi="Times New Roman" w:cs="Times New Roman"/>
+                <w:noProof/>
+                <w:webHidden/>
+              </w:rPr>
+              <w:fldChar w:fldCharType="begin"/>
+            </w:r>
+            <w:r>
+              <w:rPr>
+                <w:rFonts w:ascii="Times New Roman" w:hAnsi="Times New Roman" w:cs="Times New Roman"/>
+                <w:noProof/>
+                <w:webHidden/>
+              </w:rPr>
+              <w:instrText xml:space="preserve"> PAGEREF _Toc228457251 \h </w:instrText>
+            </w:r>
+            <w:r>
+              <w:rPr>
+                <w:rFonts w:ascii="Times New Roman" w:hAnsi="Times New Roman" w:cs="Times New Roman"/>
+                <w:noProof/>
+                <w:webHidden/>
+              </w:rPr>
+            </w:r>
+            <w:r>
+              <w:rPr>
+                <w:rFonts w:ascii="Times New Roman" w:hAnsi="Times New Roman" w:cs="Times New Roman"/>
+                <w:noProof/>
+                <w:webHidden/>
+              </w:rPr>
+              <w:fldChar w:fldCharType="separate"/>
+            </w:r>
+            <w:r>
+              <w:rPr>
+                <w:rFonts w:ascii="Times New Roman" w:hAnsi="Times New Roman" w:cs="Times New Roman"/>
+                <w:noProof/>
+                <w:webHidden/>
+              </w:rPr>
+              <w:t>19</w:t>
+            </w:r>
+            <w:r>
+              <w:rPr>
+                <w:rFonts w:ascii="Times New Roman" w:hAnsi="Times New Roman" w:cs="Times New Roman"/>
+                <w:noProof/>
+                <w:webHidden/>
+              </w:rPr>
+              <w:fldChar w:fldCharType="end"/>
+            </w:r>
+          </w:hyperlink>
+        </w:p>
+        <w:p>
+          <w:pPr>
+            <w:pStyle w:val="TOC3"/>
+            <w:tabs>
+              <w:tab w:val="right" w:leader="dot" w:pos="9016"/>
+            </w:tabs>
+            <w:rPr>
+              <w:rFonts w:ascii="Times New Roman" w:eastAsiaTheme="minorEastAsia" w:hAnsi="Times New Roman" w:cs="Times New Roman"/>
+              <w:noProof/>
+              <w:lang w:eastAsia="en-GB"/>
+            </w:rPr>
+          </w:pPr>
+          <w:hyperlink w:anchor="_Toc228457252" w:history="1">
+            <w:r>
+              <w:rPr>
+                <w:rStyle w:val="Hyperlink"/>
+                <w:rFonts w:ascii="Times New Roman" w:hAnsi="Times New Roman" w:cs="Times New Roman"/>
+                <w:noProof/>
+              </w:rPr>
+              <w:t>What is a prototype?</w:t>
+            </w:r>
+            <w:r>
+              <w:rPr>
+                <w:rFonts w:ascii="Times New Roman" w:hAnsi="Times New Roman" w:cs="Times New Roman"/>
+                <w:noProof/>
+                <w:webHidden/>
+              </w:rPr>
+              <w:tab/>
+            </w:r>
+            <w:r>
+              <w:rPr>
+                <w:rFonts w:ascii="Times New Roman" w:hAnsi="Times New Roman" w:cs="Times New Roman"/>
+                <w:noProof/>
+                <w:webHidden/>
+              </w:rPr>
+              <w:fldChar w:fldCharType="begin"/>
+            </w:r>
+            <w:r>
+              <w:rPr>
+                <w:rFonts w:ascii="Times New Roman" w:hAnsi="Times New Roman" w:cs="Times New Roman"/>
+                <w:noProof/>
+                <w:webHidden/>
+              </w:rPr>
+              <w:instrText xml:space="preserve"> PAGEREF _Toc228457252 \h </w:instrText>
+            </w:r>
+            <w:r>
+              <w:rPr>
+                <w:rFonts w:ascii="Times New Roman" w:hAnsi="Times New Roman" w:cs="Times New Roman"/>
+                <w:noProof/>
+                <w:webHidden/>
+              </w:rPr>
+            </w:r>
+            <w:r>
+              <w:rPr>
+                <w:rFonts w:ascii="Times New Roman" w:hAnsi="Times New Roman" w:cs="Times New Roman"/>
+                <w:noProof/>
+                <w:webHidden/>
+              </w:rPr>
+              <w:fldChar w:fldCharType="separate"/>
+            </w:r>
+            <w:r>
+              <w:rPr>
+                <w:rFonts w:ascii="Times New Roman" w:hAnsi="Times New Roman" w:cs="Times New Roman"/>
+                <w:noProof/>
+                <w:webHidden/>
+              </w:rPr>
+              <w:t>19</w:t>
+            </w:r>
+            <w:r>
+              <w:rPr>
+                <w:rFonts w:ascii="Times New Roman" w:hAnsi="Times New Roman" w:cs="Times New Roman"/>
+                <w:noProof/>
+                <w:webHidden/>
+              </w:rPr>
+              <w:fldChar w:fldCharType="end"/>
+            </w:r>
+          </w:hyperlink>
+        </w:p>
+        <w:p>
+          <w:pPr>
+            <w:pStyle w:val="TOC3"/>
+            <w:tabs>
+              <w:tab w:val="right" w:leader="dot" w:pos="9016"/>
+            </w:tabs>
+            <w:rPr>
+              <w:rFonts w:ascii="Times New Roman" w:eastAsiaTheme="minorEastAsia" w:hAnsi="Times New Roman" w:cs="Times New Roman"/>
+              <w:noProof/>
+              <w:lang w:eastAsia="en-GB"/>
+            </w:rPr>
+          </w:pPr>
+          <w:hyperlink w:anchor="_Toc228457253" w:history="1">
+            <w:r>
+              <w:rPr>
+                <w:rStyle w:val="Hyperlink"/>
+                <w:rFonts w:ascii="Times New Roman" w:hAnsi="Times New Roman" w:cs="Times New Roman"/>
+                <w:noProof/>
+              </w:rPr>
+              <w:t>Tool used to make prototype?</w:t>
+            </w:r>
+            <w:r>
+              <w:rPr>
+                <w:rFonts w:ascii="Times New Roman" w:hAnsi="Times New Roman" w:cs="Times New Roman"/>
+                <w:noProof/>
+                <w:webHidden/>
+              </w:rPr>
+              <w:tab/>
+            </w:r>
+            <w:r>
+              <w:rPr>
+                <w:rFonts w:ascii="Times New Roman" w:hAnsi="Times New Roman" w:cs="Times New Roman"/>
+                <w:noProof/>
+                <w:webHidden/>
+              </w:rPr>
+              <w:fldChar w:fldCharType="begin"/>
+            </w:r>
+            <w:r>
+              <w:rPr>
+                <w:rFonts w:ascii="Times New Roman" w:hAnsi="Times New Roman" w:cs="Times New Roman"/>
+                <w:noProof/>
+                <w:webHidden/>
+              </w:rPr>
+              <w:instrText xml:space="preserve"> PAGEREF _Toc228457253 \h </w:instrText>
+            </w:r>
+            <w:r>
+              <w:rPr>
+                <w:rFonts w:ascii="Times New Roman" w:hAnsi="Times New Roman" w:cs="Times New Roman"/>
+                <w:noProof/>
+                <w:webHidden/>
+              </w:rPr>
+            </w:r>
+            <w:r>
+              <w:rPr>
+                <w:rFonts w:ascii="Times New Roman" w:hAnsi="Times New Roman" w:cs="Times New Roman"/>
+                <w:noProof/>
+                <w:webHidden/>
+              </w:rPr>
+              <w:fldChar w:fldCharType="separate"/>
+            </w:r>
+            <w:r>
+              <w:rPr>
+                <w:rFonts w:ascii="Times New Roman" w:hAnsi="Times New Roman" w:cs="Times New Roman"/>
+                <w:noProof/>
+                <w:webHidden/>
+              </w:rPr>
+              <w:t>19</w:t>
+            </w:r>
+            <w:r>
+              <w:rPr>
+                <w:rFonts w:ascii="Times New Roman" w:hAnsi="Times New Roman" w:cs="Times New Roman"/>
+                <w:noProof/>
+                <w:webHidden/>
+              </w:rPr>
+              <w:fldChar w:fldCharType="end"/>
+            </w:r>
+          </w:hyperlink>
+        </w:p>
+        <w:p>
+          <w:pPr>
+            <w:pStyle w:val="TOC3"/>
+            <w:tabs>
+              <w:tab w:val="right" w:leader="dot" w:pos="9016"/>
+            </w:tabs>
+            <w:rPr>
+              <w:rFonts w:ascii="Times New Roman" w:eastAsiaTheme="minorEastAsia" w:hAnsi="Times New Roman" w:cs="Times New Roman"/>
+              <w:noProof/>
+              <w:lang w:eastAsia="en-GB"/>
+            </w:rPr>
+          </w:pPr>
+          <w:hyperlink w:anchor="_Toc228457254" w:history="1">
+            <w:r>
+              <w:rPr>
+                <w:rStyle w:val="Hyperlink"/>
+                <w:rFonts w:ascii="Times New Roman" w:hAnsi="Times New Roman" w:cs="Times New Roman"/>
+                <w:noProof/>
+              </w:rPr>
+              <w:t>Screenshot of app:</w:t>
+            </w:r>
+            <w:r>
+              <w:rPr>
+                <w:rFonts w:ascii="Times New Roman" w:hAnsi="Times New Roman" w:cs="Times New Roman"/>
+                <w:noProof/>
+                <w:webHidden/>
+              </w:rPr>
+              <w:tab/>
+            </w:r>
+            <w:r>
+              <w:rPr>
+                <w:rFonts w:ascii="Times New Roman" w:hAnsi="Times New Roman" w:cs="Times New Roman"/>
+                <w:noProof/>
+                <w:webHidden/>
+              </w:rPr>
+              <w:fldChar w:fldCharType="begin"/>
+            </w:r>
+            <w:r>
+              <w:rPr>
+                <w:rFonts w:ascii="Times New Roman" w:hAnsi="Times New Roman" w:cs="Times New Roman"/>
+                <w:noProof/>
+                <w:webHidden/>
+              </w:rPr>
+              <w:instrText xml:space="preserve"> PAGEREF _Toc228457254 \h </w:instrText>
+            </w:r>
+            <w:r>
+              <w:rPr>
+                <w:rFonts w:ascii="Times New Roman" w:hAnsi="Times New Roman" w:cs="Times New Roman"/>
+                <w:noProof/>
+                <w:webHidden/>
+              </w:rPr>
+            </w:r>
+            <w:r>
+              <w:rPr>
+                <w:rFonts w:ascii="Times New Roman" w:hAnsi="Times New Roman" w:cs="Times New Roman"/>
+                <w:noProof/>
+                <w:webHidden/>
+              </w:rPr>
+              <w:fldChar w:fldCharType="separate"/>
+            </w:r>
+            <w:r>
+              <w:rPr>
+                <w:rFonts w:ascii="Times New Roman" w:hAnsi="Times New Roman" w:cs="Times New Roman"/>
+                <w:noProof/>
+                <w:webHidden/>
+              </w:rPr>
+              <w:t>19</w:t>
             </w:r>
             <w:r>
               <w:rPr>
@@ -6564,7 +7422,7 @@
           <w:rFonts w:ascii="Times New Roman" w:hAnsi="Times New Roman" w:cs="Times New Roman"/>
         </w:rPr>
       </w:pPr>
-      <w:bookmarkStart w:id="0" w:name="_Toc227176348"/>
+      <w:bookmarkStart w:id="0" w:name="_Toc228457212"/>
       <w:r>
         <w:rPr>
           <w:rFonts w:ascii="Times New Roman" w:hAnsi="Times New Roman" w:cs="Times New Roman"/>
@@ -6581,7 +7439,7 @@
           <w:rFonts w:ascii="Times New Roman" w:hAnsi="Times New Roman" w:cs="Times New Roman"/>
         </w:rPr>
       </w:pPr>
-      <w:bookmarkStart w:id="1" w:name="_Toc227176349"/>
+      <w:bookmarkStart w:id="1" w:name="_Toc228457213"/>
       <w:r>
         <w:rPr>
           <w:rFonts w:ascii="Times New Roman" w:hAnsi="Times New Roman" w:cs="Times New Roman"/>
@@ -6610,7 +7468,7 @@
           <w:rFonts w:ascii="Times New Roman" w:hAnsi="Times New Roman" w:cs="Times New Roman"/>
         </w:rPr>
       </w:pPr>
-      <w:bookmarkStart w:id="2" w:name="_Toc227176350"/>
+      <w:bookmarkStart w:id="2" w:name="_Toc228457214"/>
       <w:r>
         <w:rPr>
           <w:rFonts w:ascii="Times New Roman" w:hAnsi="Times New Roman" w:cs="Times New Roman"/>
@@ -6639,7 +7497,7 @@
           <w:rFonts w:ascii="Times New Roman" w:hAnsi="Times New Roman" w:cs="Times New Roman"/>
         </w:rPr>
       </w:pPr>
-      <w:bookmarkStart w:id="3" w:name="_Toc227176351"/>
+      <w:bookmarkStart w:id="3" w:name="_Toc228457215"/>
       <w:r>
         <w:rPr>
           <w:rFonts w:ascii="Times New Roman" w:hAnsi="Times New Roman" w:cs="Times New Roman"/>
@@ -6668,7 +7526,7 @@
           <w:rFonts w:ascii="Times New Roman" w:hAnsi="Times New Roman" w:cs="Times New Roman"/>
         </w:rPr>
       </w:pPr>
-      <w:bookmarkStart w:id="4" w:name="_Toc227176352"/>
+      <w:bookmarkStart w:id="4" w:name="_Toc228457216"/>
       <w:r>
         <w:rPr>
           <w:rFonts w:ascii="Times New Roman" w:hAnsi="Times New Roman" w:cs="Times New Roman"/>
@@ -6697,7 +7555,7 @@
           <w:rFonts w:ascii="Times New Roman" w:hAnsi="Times New Roman" w:cs="Times New Roman"/>
         </w:rPr>
       </w:pPr>
-      <w:bookmarkStart w:id="5" w:name="_Toc227176353"/>
+      <w:bookmarkStart w:id="5" w:name="_Toc228457217"/>
       <w:r>
         <w:rPr>
           <w:rFonts w:ascii="Times New Roman" w:hAnsi="Times New Roman" w:cs="Times New Roman"/>
@@ -6726,7 +7584,7 @@
           <w:rFonts w:ascii="Times New Roman" w:hAnsi="Times New Roman" w:cs="Times New Roman"/>
         </w:rPr>
       </w:pPr>
-      <w:bookmarkStart w:id="6" w:name="_Toc227176354"/>
+      <w:bookmarkStart w:id="6" w:name="_Toc228457218"/>
       <w:r>
         <w:rPr>
           <w:rFonts w:ascii="Times New Roman" w:hAnsi="Times New Roman" w:cs="Times New Roman"/>
@@ -6761,7 +7619,7 @@
           <w:rFonts w:ascii="Times New Roman" w:hAnsi="Times New Roman" w:cs="Times New Roman"/>
         </w:rPr>
       </w:pPr>
-      <w:bookmarkStart w:id="7" w:name="_Toc227176355"/>
+      <w:bookmarkStart w:id="7" w:name="_Toc228457219"/>
       <w:r>
         <w:rPr>
           <w:rFonts w:ascii="Times New Roman" w:hAnsi="Times New Roman" w:cs="Times New Roman"/>
@@ -6780,7 +7638,7 @@
           <w:color w:val="156082" w:themeColor="accent1"/>
         </w:rPr>
       </w:pPr>
-      <w:bookmarkStart w:id="8" w:name="_Toc227176356"/>
+      <w:bookmarkStart w:id="8" w:name="_Toc228457220"/>
       <w:r>
         <w:rPr>
           <w:rFonts w:ascii="Times New Roman" w:hAnsi="Times New Roman" w:cs="Times New Roman"/>
@@ -7296,7 +8154,7 @@
           <w:rFonts w:ascii="Times New Roman" w:hAnsi="Times New Roman" w:cs="Times New Roman"/>
         </w:rPr>
       </w:pPr>
-      <w:bookmarkStart w:id="9" w:name="_Toc227176357"/>
+      <w:bookmarkStart w:id="9" w:name="_Toc228457221"/>
       <w:r>
         <w:rPr>
           <w:rFonts w:ascii="Times New Roman" w:hAnsi="Times New Roman" w:cs="Times New Roman"/>
@@ -7618,7 +8476,7 @@
           <w:rFonts w:ascii="Times New Roman" w:hAnsi="Times New Roman" w:cs="Times New Roman"/>
         </w:rPr>
       </w:pPr>
-      <w:bookmarkStart w:id="10" w:name="_Toc227176358"/>
+      <w:bookmarkStart w:id="10" w:name="_Toc228457222"/>
       <w:r>
         <w:rPr>
           <w:rFonts w:ascii="Times New Roman" w:hAnsi="Times New Roman" w:cs="Times New Roman"/>
@@ -7636,7 +8494,7 @@
           <w:rFonts w:ascii="Times New Roman" w:hAnsi="Times New Roman" w:cs="Times New Roman"/>
         </w:rPr>
       </w:pPr>
-      <w:bookmarkStart w:id="11" w:name="_Toc227176359"/>
+      <w:bookmarkStart w:id="11" w:name="_Toc228457223"/>
       <w:r>
         <w:rPr>
           <w:rFonts w:ascii="Times New Roman" w:hAnsi="Times New Roman" w:cs="Times New Roman"/>
@@ -7869,7 +8727,7 @@
           <w:rFonts w:ascii="Times New Roman" w:hAnsi="Times New Roman" w:cs="Times New Roman"/>
         </w:rPr>
       </w:pPr>
-      <w:bookmarkStart w:id="12" w:name="_Toc227176360"/>
+      <w:bookmarkStart w:id="12" w:name="_Toc228457224"/>
       <w:r>
         <w:rPr>
           <w:rFonts w:ascii="Times New Roman" w:hAnsi="Times New Roman" w:cs="Times New Roman"/>
@@ -8085,7 +8943,7 @@
           <w:rFonts w:ascii="Times New Roman" w:hAnsi="Times New Roman" w:cs="Times New Roman"/>
         </w:rPr>
       </w:pPr>
-      <w:bookmarkStart w:id="13" w:name="_Toc227176361"/>
+      <w:bookmarkStart w:id="13" w:name="_Toc228457225"/>
       <w:r>
         <w:rPr>
           <w:rFonts w:ascii="Times New Roman" w:hAnsi="Times New Roman" w:cs="Times New Roman"/>
@@ -8417,7 +9275,7 @@
           <w:rFonts w:ascii="Times New Roman" w:hAnsi="Times New Roman" w:cs="Times New Roman"/>
         </w:rPr>
       </w:pPr>
-      <w:bookmarkStart w:id="14" w:name="_Toc227176362"/>
+      <w:bookmarkStart w:id="14" w:name="_Toc228457226"/>
       <w:r>
         <w:rPr>
           <w:rFonts w:ascii="Times New Roman" w:hAnsi="Times New Roman" w:cs="Times New Roman"/>
@@ -8684,7 +9542,7 @@
           <w:rFonts w:ascii="Times New Roman" w:hAnsi="Times New Roman" w:cs="Times New Roman"/>
         </w:rPr>
       </w:pPr>
-      <w:bookmarkStart w:id="15" w:name="_Toc227176363"/>
+      <w:bookmarkStart w:id="15" w:name="_Toc228457227"/>
       <w:r>
         <w:rPr>
           <w:rFonts w:ascii="Times New Roman" w:hAnsi="Times New Roman" w:cs="Times New Roman"/>
@@ -8701,7 +9559,7 @@
           <w:rFonts w:ascii="Times New Roman" w:hAnsi="Times New Roman" w:cs="Times New Roman"/>
         </w:rPr>
       </w:pPr>
-      <w:bookmarkStart w:id="16" w:name="_Toc227176364"/>
+      <w:bookmarkStart w:id="16" w:name="_Toc228457228"/>
       <w:r>
         <w:rPr>
           <w:rFonts w:ascii="Times New Roman" w:hAnsi="Times New Roman" w:cs="Times New Roman"/>
@@ -9266,7 +10124,7 @@
           <w:rFonts w:ascii="Times New Roman" w:hAnsi="Times New Roman" w:cs="Times New Roman"/>
         </w:rPr>
       </w:pPr>
-      <w:bookmarkStart w:id="17" w:name="_Toc227176365"/>
+      <w:bookmarkStart w:id="17" w:name="_Toc228457229"/>
       <w:r>
         <w:rPr>
           <w:rFonts w:ascii="Times New Roman" w:hAnsi="Times New Roman" w:cs="Times New Roman"/>
@@ -9820,7 +10678,7 @@
           <w:rFonts w:ascii="Times New Roman" w:hAnsi="Times New Roman" w:cs="Times New Roman"/>
         </w:rPr>
       </w:pPr>
-      <w:bookmarkStart w:id="18" w:name="_Toc227176366"/>
+      <w:bookmarkStart w:id="18" w:name="_Toc228457230"/>
       <w:r>
         <w:rPr>
           <w:rFonts w:ascii="Times New Roman" w:hAnsi="Times New Roman" w:cs="Times New Roman"/>
@@ -10339,7 +11197,7 @@
           <w:rFonts w:ascii="Times New Roman" w:hAnsi="Times New Roman" w:cs="Times New Roman"/>
         </w:rPr>
       </w:pPr>
-      <w:bookmarkStart w:id="19" w:name="_Toc227176367"/>
+      <w:bookmarkStart w:id="19" w:name="_Toc228457231"/>
       <w:r>
         <w:rPr>
           <w:rFonts w:ascii="Times New Roman" w:hAnsi="Times New Roman" w:cs="Times New Roman"/>
@@ -10939,7 +11797,7 @@
         </w:rPr>
         <w:br w:type="page"/>
       </w:r>
-      <w:bookmarkStart w:id="20" w:name="_Toc227176368"/>
+      <w:bookmarkStart w:id="20" w:name="_Toc228457232"/>
       <w:r>
         <w:rPr>
           <w:rFonts w:ascii="Times New Roman" w:hAnsi="Times New Roman" w:cs="Times New Roman"/>
@@ -11453,7 +12311,7 @@
           <w:rFonts w:ascii="Times New Roman" w:hAnsi="Times New Roman" w:cs="Times New Roman"/>
         </w:rPr>
       </w:pPr>
-      <w:bookmarkStart w:id="21" w:name="_Toc227176369"/>
+      <w:bookmarkStart w:id="21" w:name="_Toc228457233"/>
       <w:r>
         <w:rPr>
           <w:rFonts w:ascii="Times New Roman" w:hAnsi="Times New Roman" w:cs="Times New Roman"/>
@@ -11470,7 +12328,7 @@
           <w:rFonts w:ascii="Times New Roman" w:hAnsi="Times New Roman" w:cs="Times New Roman"/>
         </w:rPr>
       </w:pPr>
-      <w:bookmarkStart w:id="22" w:name="_Toc227176370"/>
+      <w:bookmarkStart w:id="22" w:name="_Toc228457234"/>
       <w:r>
         <w:rPr>
           <w:rFonts w:ascii="Times New Roman" w:hAnsi="Times New Roman" w:cs="Times New Roman"/>
@@ -11558,7 +12416,7 @@
           <w:rFonts w:ascii="Times New Roman" w:hAnsi="Times New Roman" w:cs="Times New Roman"/>
         </w:rPr>
       </w:pPr>
-      <w:bookmarkStart w:id="23" w:name="_Toc227176371"/>
+      <w:bookmarkStart w:id="23" w:name="_Toc228457235"/>
       <w:r>
         <w:rPr>
           <w:rFonts w:ascii="Times New Roman" w:hAnsi="Times New Roman" w:cs="Times New Roman"/>
@@ -11694,7 +12552,7 @@
           <w:rFonts w:ascii="Times New Roman" w:hAnsi="Times New Roman" w:cs="Times New Roman"/>
         </w:rPr>
       </w:pPr>
-      <w:bookmarkStart w:id="24" w:name="_Toc227176372"/>
+      <w:bookmarkStart w:id="24" w:name="_Toc228457236"/>
       <w:r>
         <w:rPr>
           <w:rFonts w:ascii="Times New Roman" w:hAnsi="Times New Roman" w:cs="Times New Roman"/>
@@ -11825,7 +12683,7 @@
           <w:rFonts w:ascii="Times New Roman" w:hAnsi="Times New Roman" w:cs="Times New Roman"/>
         </w:rPr>
       </w:pPr>
-      <w:bookmarkStart w:id="25" w:name="_Toc227176373"/>
+      <w:bookmarkStart w:id="25" w:name="_Toc228457237"/>
       <w:r>
         <w:rPr>
           <w:rFonts w:ascii="Times New Roman" w:hAnsi="Times New Roman" w:cs="Times New Roman"/>
@@ -11908,7 +12766,7 @@
           <w:rFonts w:ascii="Times New Roman" w:hAnsi="Times New Roman" w:cs="Times New Roman"/>
         </w:rPr>
       </w:pPr>
-      <w:bookmarkStart w:id="26" w:name="_Toc227176374"/>
+      <w:bookmarkStart w:id="26" w:name="_Toc228457238"/>
       <w:r>
         <w:rPr>
           <w:rFonts w:ascii="Times New Roman" w:hAnsi="Times New Roman" w:cs="Times New Roman"/>
@@ -11990,7 +12848,7 @@
           <w:rFonts w:ascii="Times New Roman" w:hAnsi="Times New Roman" w:cs="Times New Roman"/>
         </w:rPr>
       </w:pPr>
-      <w:bookmarkStart w:id="27" w:name="_Toc227176375"/>
+      <w:bookmarkStart w:id="27" w:name="_Toc228457239"/>
       <w:r>
         <w:rPr>
           <w:rFonts w:ascii="Times New Roman" w:hAnsi="Times New Roman" w:cs="Times New Roman"/>
@@ -12007,7 +12865,7 @@
           <w:rFonts w:ascii="Times New Roman" w:hAnsi="Times New Roman" w:cs="Times New Roman"/>
         </w:rPr>
       </w:pPr>
-      <w:bookmarkStart w:id="28" w:name="_Toc227176376"/>
+      <w:bookmarkStart w:id="28" w:name="_Toc228457240"/>
       <w:r>
         <w:rPr>
           <w:rFonts w:ascii="Times New Roman" w:hAnsi="Times New Roman" w:cs="Times New Roman"/>
@@ -12100,7 +12958,7 @@
           <w:rFonts w:ascii="Times New Roman" w:hAnsi="Times New Roman" w:cs="Times New Roman"/>
         </w:rPr>
       </w:pPr>
-      <w:bookmarkStart w:id="29" w:name="_Toc227176377"/>
+      <w:bookmarkStart w:id="29" w:name="_Toc228457241"/>
       <w:r>
         <w:rPr>
           <w:rFonts w:ascii="Times New Roman" w:hAnsi="Times New Roman" w:cs="Times New Roman"/>
@@ -12189,7 +13047,7 @@
           <w:rFonts w:ascii="Times New Roman" w:hAnsi="Times New Roman" w:cs="Times New Roman"/>
         </w:rPr>
       </w:pPr>
-      <w:bookmarkStart w:id="30" w:name="_Toc227176378"/>
+      <w:bookmarkStart w:id="30" w:name="_Toc228457242"/>
       <w:r>
         <w:rPr>
           <w:rFonts w:ascii="Times New Roman" w:hAnsi="Times New Roman" w:cs="Times New Roman"/>
@@ -12265,7 +13123,7 @@
         </w:rPr>
         <w:br w:type="page"/>
       </w:r>
-      <w:bookmarkStart w:id="31" w:name="_Toc227176379"/>
+      <w:bookmarkStart w:id="31" w:name="_Toc228457243"/>
       <w:r>
         <w:rPr>
           <w:rFonts w:ascii="Times New Roman" w:hAnsi="Times New Roman" w:cs="Times New Roman"/>
@@ -12321,12 +13179,14 @@
           <w:rFonts w:ascii="Times New Roman" w:hAnsi="Times New Roman" w:cs="Times New Roman"/>
         </w:rPr>
       </w:pPr>
+      <w:bookmarkStart w:id="32" w:name="_Toc228457244"/>
       <w:r>
         <w:rPr>
           <w:rFonts w:ascii="Times New Roman" w:hAnsi="Times New Roman" w:cs="Times New Roman"/>
         </w:rPr>
         <w:t>Feature 1 - User Authentication</w:t>
       </w:r>
+      <w:bookmarkEnd w:id="32"/>
     </w:p>
     <w:p>
       <w:pPr>
@@ -12600,12 +13460,14 @@
           <w:rFonts w:ascii="Times New Roman" w:hAnsi="Times New Roman" w:cs="Times New Roman"/>
         </w:rPr>
       </w:pPr>
+      <w:bookmarkStart w:id="33" w:name="_Toc228457245"/>
       <w:r>
         <w:rPr>
           <w:rFonts w:ascii="Times New Roman" w:hAnsi="Times New Roman" w:cs="Times New Roman"/>
         </w:rPr>
         <w:t>Feature 2 - Live Parking Map</w:t>
       </w:r>
+      <w:bookmarkEnd w:id="33"/>
     </w:p>
     <w:p>
       <w:pPr>
@@ -12775,12 +13637,14 @@
           <w:rFonts w:ascii="Times New Roman" w:hAnsi="Times New Roman" w:cs="Times New Roman"/>
         </w:rPr>
       </w:pPr>
+      <w:bookmarkStart w:id="34" w:name="_Toc228457246"/>
       <w:r>
         <w:rPr>
           <w:rFonts w:ascii="Times New Roman" w:hAnsi="Times New Roman" w:cs="Times New Roman"/>
         </w:rPr>
         <w:t>Feature 3 - Digital Reservation</w:t>
       </w:r>
+      <w:bookmarkEnd w:id="34"/>
     </w:p>
     <w:p>
       <w:pPr>
@@ -13027,12 +13891,14 @@
           <w:rFonts w:ascii="Times New Roman" w:hAnsi="Times New Roman" w:cs="Times New Roman"/>
         </w:rPr>
       </w:pPr>
+      <w:bookmarkStart w:id="35" w:name="_Toc228457247"/>
       <w:r>
         <w:rPr>
           <w:rFonts w:ascii="Times New Roman" w:hAnsi="Times New Roman" w:cs="Times New Roman"/>
         </w:rPr>
         <w:t>Feature 4 - Capacity and Peak Time Analytics</w:t>
       </w:r>
+      <w:bookmarkEnd w:id="35"/>
     </w:p>
     <w:p>
       <w:pPr>
@@ -13341,6 +14207,7 @@
           <w:rFonts w:ascii="Times New Roman" w:hAnsi="Times New Roman" w:cs="Times New Roman"/>
         </w:rPr>
       </w:pPr>
+      <w:bookmarkStart w:id="36" w:name="_Toc228457248"/>
       <w:r>
         <w:rPr>
           <w:rFonts w:ascii="Times New Roman" w:hAnsi="Times New Roman" w:cs="Times New Roman"/>
@@ -13348,6 +14215,7 @@
         <w:lastRenderedPageBreak/>
         <w:t>Use Case Diagram</w:t>
       </w:r>
+      <w:bookmarkEnd w:id="36"/>
     </w:p>
     <w:p>
       <w:pPr>
@@ -13372,19 +14240,15 @@
           <w:rFonts w:ascii="Times New Roman" w:hAnsi="Times New Roman" w:cs="Times New Roman"/>
         </w:rPr>
       </w:pPr>
+      <w:bookmarkStart w:id="37" w:name="_Toc228457249"/>
       <w:r>
         <w:rPr>
           <w:rFonts w:ascii="Times New Roman" w:hAnsi="Times New Roman" w:cs="Times New Roman"/>
         </w:rPr>
         <w:lastRenderedPageBreak/>
-        <w:t xml:space="preserve">Activity </w:t>
-      </w:r>
-      <w:r>
-        <w:rPr>
-          <w:rFonts w:ascii="Times New Roman" w:hAnsi="Times New Roman" w:cs="Times New Roman"/>
-        </w:rPr>
-        <w:t>Diagram</w:t>
-      </w:r>
+        <w:t>Activity Diagram</w:t>
+      </w:r>
+      <w:bookmarkEnd w:id="37"/>
     </w:p>
     <w:p>
       <w:pPr>
@@ -13409,19 +14273,15 @@
           <w:rFonts w:ascii="Times New Roman" w:hAnsi="Times New Roman" w:cs="Times New Roman"/>
         </w:rPr>
       </w:pPr>
+      <w:bookmarkStart w:id="38" w:name="_Toc228457250"/>
       <w:r>
         <w:rPr>
           <w:rFonts w:ascii="Times New Roman" w:hAnsi="Times New Roman" w:cs="Times New Roman"/>
         </w:rPr>
         <w:lastRenderedPageBreak/>
-        <w:t xml:space="preserve">Class </w:t>
-      </w:r>
-      <w:r>
-        <w:rPr>
-          <w:rFonts w:ascii="Times New Roman" w:hAnsi="Times New Roman" w:cs="Times New Roman"/>
-        </w:rPr>
-        <w:t>Diagram</w:t>
-      </w:r>
+        <w:t>Class Diagram</w:t>
+      </w:r>
+      <w:bookmarkEnd w:id="38"/>
       <w:r>
         <w:rPr>
           <w:rFonts w:ascii="Times New Roman" w:hAnsi="Times New Roman" w:cs="Times New Roman"/>
@@ -13436,6 +14296,7 @@
           <w:rFonts w:ascii="Times New Roman" w:hAnsi="Times New Roman" w:cs="Times New Roman"/>
         </w:rPr>
       </w:pPr>
+      <w:bookmarkStart w:id="39" w:name="_Toc228457251"/>
       <w:r>
         <w:rPr>
           <w:rFonts w:ascii="Times New Roman" w:hAnsi="Times New Roman" w:cs="Times New Roman"/>
@@ -13443,8 +14304,128 @@
         <w:lastRenderedPageBreak/>
         <w:t>SETU Park Prototype</w:t>
       </w:r>
-    </w:p>
-    <w:p/>
+      <w:bookmarkEnd w:id="39"/>
+    </w:p>
+    <w:p>
+      <w:pPr>
+        <w:pStyle w:val="Heading3"/>
+        <w:rPr>
+          <w:rFonts w:ascii="Times New Roman" w:hAnsi="Times New Roman" w:cs="Times New Roman"/>
+        </w:rPr>
+      </w:pPr>
+      <w:bookmarkStart w:id="40" w:name="_Toc228457252"/>
+      <w:r>
+        <w:rPr>
+          <w:rFonts w:ascii="Times New Roman" w:hAnsi="Times New Roman" w:cs="Times New Roman"/>
+        </w:rPr>
+        <w:t>What is a prototype?</w:t>
+      </w:r>
+      <w:bookmarkEnd w:id="40"/>
+    </w:p>
+    <w:p>
+      <w:pPr>
+        <w:rPr>
+          <w:rFonts w:ascii="Times New Roman" w:hAnsi="Times New Roman" w:cs="Times New Roman"/>
+        </w:rPr>
+      </w:pPr>
+      <w:r>
+        <w:rPr>
+          <w:rFonts w:ascii="Times New Roman" w:hAnsi="Times New Roman" w:cs="Times New Roman"/>
+        </w:rPr>
+        <w:t>A prototype of an app is a</w:t>
+      </w:r>
+      <w:r>
+        <w:rPr>
+          <w:rFonts w:ascii="Times New Roman" w:hAnsi="Times New Roman" w:cs="Times New Roman"/>
+        </w:rPr>
+        <w:t xml:space="preserve"> </w:t>
+      </w:r>
+      <w:r>
+        <w:rPr>
+          <w:rFonts w:ascii="Times New Roman" w:hAnsi="Times New Roman" w:cs="Times New Roman"/>
+        </w:rPr>
+        <w:t>simplified version of the application used to demonstrate how it will look and work before full development begins.</w:t>
+      </w:r>
+    </w:p>
+    <w:p>
+      <w:pPr>
+        <w:pStyle w:val="Heading3"/>
+        <w:rPr>
+          <w:rFonts w:ascii="Times New Roman" w:hAnsi="Times New Roman" w:cs="Times New Roman"/>
+        </w:rPr>
+      </w:pPr>
+    </w:p>
+    <w:p>
+      <w:pPr>
+        <w:pStyle w:val="Heading3"/>
+        <w:rPr>
+          <w:rFonts w:ascii="Times New Roman" w:hAnsi="Times New Roman" w:cs="Times New Roman"/>
+        </w:rPr>
+      </w:pPr>
+      <w:bookmarkStart w:id="41" w:name="_Toc228457253"/>
+      <w:r>
+        <w:rPr>
+          <w:rFonts w:ascii="Times New Roman" w:hAnsi="Times New Roman" w:cs="Times New Roman"/>
+        </w:rPr>
+        <w:t>Tool used to make prototype?</w:t>
+      </w:r>
+      <w:bookmarkEnd w:id="41"/>
+    </w:p>
+    <w:p>
+      <w:pPr>
+        <w:rPr>
+          <w:rFonts w:ascii="Times New Roman" w:hAnsi="Times New Roman" w:cs="Times New Roman"/>
+        </w:rPr>
+      </w:pPr>
+      <w:r>
+        <w:rPr>
+          <w:rFonts w:ascii="Times New Roman" w:hAnsi="Times New Roman" w:cs="Times New Roman"/>
+        </w:rPr>
+        <w:t>The prototype was created by manually writing FXML code using IntelliJ IDEA as the development environment.</w:t>
+      </w:r>
+    </w:p>
+    <w:p>
+      <w:pPr>
+        <w:rPr>
+          <w:rFonts w:ascii="Times New Roman" w:hAnsi="Times New Roman" w:cs="Times New Roman"/>
+        </w:rPr>
+      </w:pPr>
+      <w:r>
+        <w:rPr>
+          <w:rFonts w:ascii="Times New Roman" w:hAnsi="Times New Roman" w:cs="Times New Roman"/>
+        </w:rPr>
+        <w:t>This approach was relatively straightforward, as I am already familiar with FXML and JavaFX. However, compared to drag-and-drop prototyping tools, it required more manual effort to design and structure the interface.</w:t>
+      </w:r>
+    </w:p>
+    <w:p>
+      <w:pPr>
+        <w:rPr>
+          <w:rFonts w:ascii="Times New Roman" w:hAnsi="Times New Roman" w:cs="Times New Roman"/>
+        </w:rPr>
+      </w:pPr>
+    </w:p>
+    <w:p>
+      <w:pPr>
+        <w:pStyle w:val="Heading3"/>
+        <w:rPr>
+          <w:rFonts w:ascii="Times New Roman" w:hAnsi="Times New Roman" w:cs="Times New Roman"/>
+        </w:rPr>
+      </w:pPr>
+      <w:bookmarkStart w:id="42" w:name="_Toc228457254"/>
+      <w:r>
+        <w:rPr>
+          <w:rFonts w:ascii="Times New Roman" w:hAnsi="Times New Roman" w:cs="Times New Roman"/>
+        </w:rPr>
+        <w:t xml:space="preserve">Screenshot of </w:t>
+      </w:r>
+      <w:r>
+        <w:rPr>
+          <w:rFonts w:ascii="Times New Roman" w:hAnsi="Times New Roman" w:cs="Times New Roman"/>
+        </w:rPr>
+        <w:t>app:</w:t>
+      </w:r>
+      <w:bookmarkEnd w:id="42"/>
+    </w:p>
     <w:p>
       <w:pPr>
         <w:spacing w:after="120"/>
@@ -13456,6 +14437,7 @@
       <w:r>
         <w:rPr>
           <w:rFonts w:ascii="Times New Roman" w:hAnsi="Times New Roman" w:cs="Times New Roman"/>
+          <w:noProof/>
         </w:rPr>
         <w:drawing>
           <wp:inline distT="0" distB="0" distL="0" distR="0" wp14:anchorId="5924CF67" wp14:editId="554D7FD6">
@@ -13494,6 +14476,160 @@
         </w:drawing>
       </w:r>
     </w:p>
+    <w:p>
+      <w:pPr>
+        <w:rPr>
+          <w:rFonts w:ascii="Times New Roman" w:hAnsi="Times New Roman" w:cs="Times New Roman"/>
+        </w:rPr>
+      </w:pPr>
+      <w:r>
+        <w:rPr>
+          <w:rFonts w:ascii="Times New Roman" w:hAnsi="Times New Roman" w:cs="Times New Roman"/>
+        </w:rPr>
+        <w:br w:type="page"/>
+      </w:r>
+    </w:p>
+    <w:p>
+      <w:pPr>
+        <w:pStyle w:val="Heading1"/>
+        <w:rPr>
+          <w:rFonts w:ascii="Times New Roman" w:hAnsi="Times New Roman" w:cs="Times New Roman"/>
+        </w:rPr>
+      </w:pPr>
+      <w:r>
+        <w:rPr>
+          <w:rFonts w:ascii="Times New Roman" w:hAnsi="Times New Roman" w:cs="Times New Roman"/>
+        </w:rPr>
+        <w:lastRenderedPageBreak/>
+        <w:t>Individual Re</w:t>
+      </w:r>
+      <w:r>
+        <w:rPr>
+          <w:rFonts w:ascii="Times New Roman" w:hAnsi="Times New Roman" w:cs="Times New Roman"/>
+        </w:rPr>
+        <w:t>flection</w:t>
+      </w:r>
+      <w:r>
+        <w:rPr>
+          <w:rFonts w:ascii="Times New Roman" w:hAnsi="Times New Roman" w:cs="Times New Roman"/>
+        </w:rPr>
+        <w:t xml:space="preserve"> - Lorcan</w:t>
+      </w:r>
+    </w:p>
+    <w:p>
+      <w:pPr>
+        <w:pStyle w:val="Heading3"/>
+      </w:pPr>
+      <w:r>
+        <w:t>What was your primary role and most significant contribution to the project?</w:t>
+      </w:r>
+    </w:p>
+    <w:p/>
+    <w:p>
+      <w:pPr>
+        <w:pStyle w:val="Heading3"/>
+      </w:pPr>
+      <w:r>
+        <w:t>Describe one challenge your team faced and explain how it was addressed.</w:t>
+      </w:r>
+    </w:p>
+    <w:p/>
+    <w:p>
+      <w:pPr>
+        <w:pStyle w:val="Heading3"/>
+      </w:pPr>
+      <w:r>
+        <w:t>Identify one technical or process decision that affected the project outcome.</w:t>
+      </w:r>
+    </w:p>
+    <w:p/>
+    <w:p>
+      <w:pPr>
+        <w:pStyle w:val="Heading3"/>
+      </w:pPr>
+      <w:r>
+        <w:t>What is one thing you would do differently in a future team software project, and why?</w:t>
+      </w:r>
+    </w:p>
+    <w:p>
+      <w:pPr>
+        <w:rPr>
+          <w:rFonts w:ascii="Times New Roman" w:eastAsiaTheme="majorEastAsia" w:hAnsi="Times New Roman" w:cs="Times New Roman"/>
+          <w:color w:val="0F4761" w:themeColor="accent1" w:themeShade="BF"/>
+          <w:sz w:val="40"/>
+          <w:szCs w:val="40"/>
+        </w:rPr>
+      </w:pPr>
+      <w:r>
+        <w:rPr>
+          <w:rFonts w:ascii="Times New Roman" w:hAnsi="Times New Roman" w:cs="Times New Roman"/>
+        </w:rPr>
+        <w:br w:type="page"/>
+      </w:r>
+    </w:p>
+    <w:p>
+      <w:pPr>
+        <w:pStyle w:val="Heading1"/>
+        <w:rPr>
+          <w:rFonts w:ascii="Times New Roman" w:hAnsi="Times New Roman" w:cs="Times New Roman"/>
+        </w:rPr>
+      </w:pPr>
+      <w:r>
+        <w:rPr>
+          <w:rFonts w:ascii="Times New Roman" w:hAnsi="Times New Roman" w:cs="Times New Roman"/>
+        </w:rPr>
+        <w:lastRenderedPageBreak/>
+        <w:t>Individual Reflection</w:t>
+      </w:r>
+      <w:r>
+        <w:rPr>
+          <w:rFonts w:ascii="Times New Roman" w:hAnsi="Times New Roman" w:cs="Times New Roman"/>
+        </w:rPr>
+        <w:t xml:space="preserve"> - </w:t>
+      </w:r>
+      <w:r>
+        <w:rPr>
+          <w:rFonts w:ascii="Times New Roman" w:hAnsi="Times New Roman" w:cs="Times New Roman"/>
+        </w:rPr>
+        <w:t>Karl</w:t>
+      </w:r>
+    </w:p>
+    <w:p>
+      <w:pPr>
+        <w:pStyle w:val="Heading3"/>
+      </w:pPr>
+      <w:r>
+        <w:t>What was your primary role and most significant contribution to the project?</w:t>
+      </w:r>
+    </w:p>
+    <w:p/>
+    <w:p>
+      <w:pPr>
+        <w:pStyle w:val="Heading3"/>
+      </w:pPr>
+      <w:r>
+        <w:t>Describe one challenge your team faced and explain how it was addressed.</w:t>
+      </w:r>
+    </w:p>
+    <w:p/>
+    <w:p>
+      <w:pPr>
+        <w:pStyle w:val="Heading3"/>
+      </w:pPr>
+      <w:r>
+        <w:t>Identify one technical or process decision that affected the project outcome.</w:t>
+      </w:r>
+    </w:p>
+    <w:p/>
+    <w:p>
+      <w:pPr>
+        <w:pStyle w:val="Heading3"/>
+      </w:pPr>
+      <w:r>
+        <w:t>What is one thing you would do differently in a future team software project, and why?</w:t>
+      </w:r>
+    </w:p>
+    <w:p/>
     <w:sectPr>
       <w:pgSz w:w="11906" w:h="16838"/>
       <w:pgMar w:top="1440" w:right="1440" w:bottom="1440" w:left="1440" w:header="708" w:footer="708" w:gutter="0"/>
@@ -17625,7 +18761,6 @@
   <w:style w:type="character" w:default="1" w:styleId="DefaultParagraphFont">
     <w:name w:val="Default Paragraph Font"/>
     <w:uiPriority w:val="1"/>
-    <w:semiHidden/>
     <w:unhideWhenUsed/>
   </w:style>
   <w:style w:type="table" w:default="1" w:styleId="TableNormal">

</xml_diff>